<commit_message>
Oppdatert Word-versjon av rapporten
</commit_message>
<xml_diff>
--- a/014 fase 4 - report/Prosjektrapport_LOG650_G07.docx
+++ b/014 fase 4 - report/Prosjektrapport_LOG650_G07.docx
@@ -227,37 +227,142 @@
         <w:pStyle w:val="FirstParagraph"/>
       </w:pPr>
       <w:r>
+        <w:t xml:space="preserve">Gjennomgangen av litteratur de siste fem årene viser en økende trend mot bruk av digitale tvillinger og maskinlæring for å håndtere disrupsjoner i forsyningskjeder. Ivanov (2021) understreker at</w:t>
+      </w:r>
+      <w:r>
+        <w:t xml:space="preserve"> </w:t>
+      </w:r>
+      <w:r>
+        <w:t xml:space="preserve">“</w:t>
+      </w:r>
+      <w:r>
+        <w:t xml:space="preserve">viability</w:t>
+      </w:r>
+      <w:r>
+        <w:t xml:space="preserve">”</w:t>
+      </w:r>
+      <w:r>
+        <w:t xml:space="preserve"> </w:t>
+      </w:r>
+      <w:r>
+        <w:t xml:space="preserve">(levedyktighet) i en forsyningskjede avhenger av evnen til rask re-konfigurering. Forskning av Hosseini et al. (2019) peker på at backup-leverandører er den mest effektive strategien for å redusere restitusjonstid. Videre har studier av Choi (2020) vist at sanntids beslutningsstøtte kan redusere økonomiske tap med opptil 30% under globale kriser som COVID-19.</w:t>
+      </w:r>
+    </w:p>
+    <w:bookmarkEnd w:id="27"/>
+    <w:bookmarkStart w:id="30" w:name="teori"/>
+    <w:p>
+      <w:pPr>
+        <w:pStyle w:val="Heading1"/>
+      </w:pPr>
+      <w:r>
+        <w:t xml:space="preserve">3.0 Teori</w:t>
+      </w:r>
+    </w:p>
+    <w:p>
+      <w:pPr>
+        <w:pStyle w:val="FirstParagraph"/>
+      </w:pPr>
+      <w:r>
+        <w:t xml:space="preserve">Prosjektet bygger på teorien om</w:t>
+      </w:r>
+      <w:r>
+        <w:t xml:space="preserve"> </w:t>
+      </w:r>
+      <w:r>
         <w:rPr>
           <w:iCs/>
           <w:i/>
         </w:rPr>
-        <w:t xml:space="preserve">(Dette kapittelet vil diskutere de viktigste bidragene de 5 siste årene innen forsyningskjederobusthet og risikostyring.)</w:t>
-      </w:r>
-    </w:p>
-    <w:bookmarkEnd w:id="27"/>
-    <w:bookmarkStart w:id="28" w:name="teori"/>
-    <w:p>
-      <w:pPr>
-        <w:pStyle w:val="Heading1"/>
-      </w:pPr>
-      <w:r>
-        <w:t xml:space="preserve">3.0 Teori</w:t>
+        <w:t xml:space="preserve">Supply Chain Resilience</w:t>
+      </w:r>
+      <w:r>
+        <w:t xml:space="preserve"> </w:t>
+      </w:r>
+      <w:r>
+        <w:t xml:space="preserve">(forsyningskjederobusthet), som defineres som evnen til å motstå, tilpasse seg og komme seg etter forstyrrelser (Ponomarov &amp; Holcomb, 2009).</w:t>
+      </w:r>
+    </w:p>
+    <w:bookmarkStart w:id="28" w:name="restitusjonstid-recovery-time"/>
+    <w:p>
+      <w:pPr>
+        <w:pStyle w:val="Heading2"/>
+      </w:pPr>
+      <w:r>
+        <w:t xml:space="preserve">3.1 Restitusjonstid (Recovery Time)</w:t>
       </w:r>
     </w:p>
     <w:p>
       <w:pPr>
         <w:pStyle w:val="FirstParagraph"/>
       </w:pPr>
+      <w:r>
+        <w:t xml:space="preserve">Teoretisk sett følger en disrupsjon en</w:t>
+      </w:r>
+      <w:r>
+        <w:t xml:space="preserve"> </w:t>
+      </w:r>
+      <w:r>
+        <w:t xml:space="preserve">“</w:t>
+      </w:r>
+      <w:r>
+        <w:t xml:space="preserve">triangel-modell</w:t>
+      </w:r>
+      <w:r>
+        <w:t xml:space="preserve">”</w:t>
+      </w:r>
+      <w:r>
+        <w:t xml:space="preserve"> </w:t>
+      </w:r>
+      <w:r>
+        <w:t xml:space="preserve">hvor ytelsen faller brått og gradvis stiger tilbake til normalen. Vår modell predikerer varigheten av denne stigningen (</w:t>
+      </w:r>
+      <w:r>
+        <w:rPr>
+          <w:rStyle w:val="VerbatimChar"/>
+        </w:rPr>
+        <w:t xml:space="preserve">full_recovery_days</w:t>
+      </w:r>
+      <w:r>
+        <w:t xml:space="preserve">).</w:t>
+      </w:r>
+    </w:p>
+    <w:bookmarkEnd w:id="28"/>
+    <w:bookmarkStart w:id="29" w:name="beslutningsteori-under-usikkerhet"/>
+    <w:p>
+      <w:pPr>
+        <w:pStyle w:val="Heading2"/>
+      </w:pPr>
+      <w:r>
+        <w:t xml:space="preserve">3.2 Beslutningsteori under usikkerhet</w:t>
+      </w:r>
+    </w:p>
+    <w:p>
+      <w:pPr>
+        <w:pStyle w:val="FirstParagraph"/>
+      </w:pPr>
+      <w:r>
+        <w:t xml:space="preserve">Vi benytter</w:t>
+      </w:r>
+      <w:r>
+        <w:t xml:space="preserve"> </w:t>
+      </w:r>
       <w:r>
         <w:rPr>
           <w:iCs/>
           <w:i/>
         </w:rPr>
-        <w:t xml:space="preserve">(Her beskrives teoretisk perspektiv på risikostyring, restitusjonstid og beslutningsteori i logistikksammenheng.)</w:t>
-      </w:r>
-    </w:p>
-    <w:bookmarkEnd w:id="28"/>
-    <w:bookmarkStart w:id="29" w:name="casebeskrivelse"/>
+        <w:t xml:space="preserve">Bounded Rationality</w:t>
+      </w:r>
+      <w:r>
+        <w:t xml:space="preserve"> </w:t>
+      </w:r>
+      <w:r>
+        <w:t xml:space="preserve">(begrenset rasjonalitet) som teoretisk rammeverk, hvor algoritmen hjelper beslutningstakere med å navigere i komplekse valgmuligheter basert på objektive terskelverdier for risiko og kostnad.</w:t>
+      </w:r>
+    </w:p>
+    <w:bookmarkEnd w:id="29"/>
+    <w:bookmarkEnd w:id="30"/>
+    <w:bookmarkStart w:id="31" w:name="casebeskrivelse"/>
     <w:p>
       <w:pPr>
         <w:pStyle w:val="Heading1"/>
@@ -274,8 +379,8 @@
         <w:t xml:space="preserve">Casestudien tar utgangspunkt i en global forsyningskjede som frakter varer fra Asia til Europa og Amerika via kritiske ruter som Suez-kanalen og Stillehavet. Problemet omhandler hvordan man skal håndtere uforutsette hendelser som cyberangrep, geopolitiske konflikter og naturkatastrofer som blokkerer disse rutene.</w:t>
       </w:r>
     </w:p>
-    <w:bookmarkEnd w:id="29"/>
-    <w:bookmarkStart w:id="32" w:name="metode-og-data"/>
+    <w:bookmarkEnd w:id="31"/>
+    <w:bookmarkStart w:id="34" w:name="metode-og-data"/>
     <w:p>
       <w:pPr>
         <w:pStyle w:val="Heading1"/>
@@ -284,7 +389,7 @@
         <w:t xml:space="preserve">5.0 Metode og data</w:t>
       </w:r>
     </w:p>
-    <w:bookmarkStart w:id="30" w:name="metode"/>
+    <w:bookmarkStart w:id="32" w:name="metode"/>
     <w:p>
       <w:pPr>
         <w:pStyle w:val="Heading2"/>
@@ -367,8 +472,8 @@
         <w:t xml:space="preserve">Python med biblioteker som Pandas, Scikit-learn, Matplotlib og Seaborn.</w:t>
       </w:r>
     </w:p>
-    <w:bookmarkEnd w:id="30"/>
-    <w:bookmarkStart w:id="31" w:name="data"/>
+    <w:bookmarkEnd w:id="32"/>
+    <w:bookmarkStart w:id="33" w:name="data"/>
     <w:p>
       <w:pPr>
         <w:pStyle w:val="Heading2"/>
@@ -512,9 +617,9 @@
         <w:t xml:space="preserve">Data er delt i et treningssett (80%) og et testsett (20%).</w:t>
       </w:r>
     </w:p>
-    <w:bookmarkEnd w:id="31"/>
-    <w:bookmarkEnd w:id="32"/>
-    <w:bookmarkStart w:id="36" w:name="modellering"/>
+    <w:bookmarkEnd w:id="33"/>
+    <w:bookmarkEnd w:id="34"/>
+    <w:bookmarkStart w:id="38" w:name="modellering"/>
     <w:p>
       <w:pPr>
         <w:pStyle w:val="Heading1"/>
@@ -523,7 +628,7 @@
         <w:t xml:space="preserve">6.0 Modellering</w:t>
       </w:r>
     </w:p>
-    <w:bookmarkStart w:id="33" w:name="terskelverdier-thresholds"/>
+    <w:bookmarkStart w:id="35" w:name="terskelverdier-thresholds"/>
     <w:p>
       <w:pPr>
         <w:pStyle w:val="Heading2"/>
@@ -618,8 +723,8 @@
         <w:t xml:space="preserve">Automatisk utløsning av tiltak.</w:t>
       </w:r>
     </w:p>
-    <w:bookmarkEnd w:id="33"/>
-    <w:bookmarkStart w:id="34" w:name="algoritme-for-rute-reallokering"/>
+    <w:bookmarkEnd w:id="35"/>
+    <w:bookmarkStart w:id="36" w:name="algoritme-for-rute-reallokering"/>
     <w:p>
       <w:pPr>
         <w:pStyle w:val="Heading2"/>
@@ -672,8 +777,8 @@
         <w:t xml:space="preserve">ved blokkering av Suez.</w:t>
       </w:r>
     </w:p>
-    <w:bookmarkEnd w:id="34"/>
-    <w:bookmarkStart w:id="35" w:name="prediksjonsmodell-2.2.3"/>
+    <w:bookmarkEnd w:id="36"/>
+    <w:bookmarkStart w:id="37" w:name="prediksjonsmodell-2.2.3"/>
     <w:p>
       <w:pPr>
         <w:pStyle w:val="Heading2"/>
@@ -687,7 +792,7 @@
         <w:pStyle w:val="FirstParagraph"/>
       </w:pPr>
       <w:r>
-        <w:t xml:space="preserve">En Lineær Regresjonsmodell er trent for å predikere restitusjonstid.</w:t>
+        <w:t xml:space="preserve">En Random Forest Regressor er trent for å predikere restitusjonstid basert på 17 variabler, inkludert industri, disrupsjonstype og økonomisk risiko.</w:t>
       </w:r>
       <w:r>
         <w:t xml:space="preserve"> </w:t>
@@ -709,7 +814,7 @@
         <w:t xml:space="preserve"> </w:t>
       </w:r>
       <w:r>
-        <w:t xml:space="preserve">31.56 dager.</w:t>
+        <w:t xml:space="preserve">32.89 dager.</w:t>
       </w:r>
       <w:r>
         <w:t xml:space="preserve"> </w:t>
@@ -731,12 +836,12 @@
         <w:t xml:space="preserve"> </w:t>
       </w:r>
       <w:r>
-        <w:t xml:space="preserve">0.3859.</w:t>
-      </w:r>
-    </w:p>
-    <w:bookmarkEnd w:id="35"/>
-    <w:bookmarkEnd w:id="36"/>
-    <w:bookmarkStart w:id="45" w:name="analyse"/>
+        <w:t xml:space="preserve">0.3356.</w:t>
+      </w:r>
+    </w:p>
+    <w:bookmarkEnd w:id="37"/>
+    <w:bookmarkEnd w:id="38"/>
+    <w:bookmarkStart w:id="47" w:name="analyse"/>
     <w:p>
       <w:pPr>
         <w:pStyle w:val="Heading1"/>
@@ -745,7 +850,7 @@
         <w:t xml:space="preserve">7.0 Analyse</w:t>
       </w:r>
     </w:p>
-    <w:bookmarkStart w:id="40" w:name="stresstesting-2.3.2"/>
+    <w:bookmarkStart w:id="42" w:name="stresstesting-2.3.2"/>
     <w:p>
       <w:pPr>
         <w:pStyle w:val="Heading2"/>
@@ -759,7 +864,7 @@
         <w:pStyle w:val="FirstParagraph"/>
       </w:pPr>
       <w:r>
-        <w:t xml:space="preserve">Simulering av en total Suez-blokkering (Risiko = 0.95).</w:t>
+        <w:t xml:space="preserve">Simulering av en total Suez-blokkering (Risiko = 0.95) viser at andelen ordrer som må omrutes eller flyttes til flyfrakt øker drastisk for å opprettholde leveringsdyktighet.</w:t>
       </w:r>
     </w:p>
     <w:p>
@@ -771,18 +876,18 @@
           <wp:inline>
             <wp:extent cx="5334000" cy="2667000"/>
             <wp:effectExtent b="0" l="0" r="0" t="0"/>
-            <wp:docPr descr="Figur 2: Skifte i beslutningsstrategier ved normal drift vs. global Suez-blokkering." title="" id="38" name="Picture"/>
+            <wp:docPr descr="Figur 2: Skifte i beslutningsstrategier ved normal drift vs. global Suez-blokkering." title="" id="40" name="Picture"/>
             <a:graphic>
               <a:graphicData uri="http://schemas.openxmlformats.org/drawingml/2006/picture">
                 <pic:pic>
                   <pic:nvPicPr>
-                    <pic:cNvPr descr="005%20report/figures/stress_test_comparison.png" id="39" name="Picture"/>
+                    <pic:cNvPr descr="005%20report/figures/stress_test_comparison.png" id="41" name="Picture"/>
                     <pic:cNvPicPr>
                       <a:picLocks noChangeArrowheads="1" noChangeAspect="1"/>
                     </pic:cNvPicPr>
                   </pic:nvPicPr>
                   <pic:blipFill>
-                    <a:blip r:embed="rId37"/>
+                    <a:blip r:embed="rId39"/>
                     <a:stretch>
                       <a:fillRect/>
                     </a:stretch>
@@ -817,8 +922,8 @@
         <w:t xml:space="preserve">Figur 2: Skifte i beslutningsstrategier ved normal drift vs. global Suez-blokkering.</w:t>
       </w:r>
     </w:p>
-    <w:bookmarkEnd w:id="40"/>
-    <w:bookmarkStart w:id="44" w:name="evaluering-av-målfunksjon-2.3.3"/>
+    <w:bookmarkEnd w:id="42"/>
+    <w:bookmarkStart w:id="46" w:name="evaluering-av-målfunksjon-2.3.3"/>
     <w:p>
       <w:pPr>
         <w:pStyle w:val="Heading2"/>
@@ -833,6 +938,72 @@
       </w:pPr>
       <w:r>
         <w:t xml:space="preserve">Sammenligning av kostnad vs. tidsbesparelse.</w:t>
+      </w:r>
+      <w:r>
+        <w:t xml:space="preserve"> </w:t>
+      </w:r>
+      <w:r>
+        <w:t xml:space="preserve">-</w:t>
+      </w:r>
+      <w:r>
+        <w:t xml:space="preserve"> </w:t>
+      </w:r>
+      <w:r>
+        <w:rPr>
+          <w:bCs/>
+          <w:b/>
+        </w:rPr>
+        <w:t xml:space="preserve">Kostnadsøkning:</w:t>
+      </w:r>
+      <w:r>
+        <w:t xml:space="preserve"> </w:t>
+      </w:r>
+      <w:r>
+        <w:t xml:space="preserve">46.51%</w:t>
+      </w:r>
+      <w:r>
+        <w:t xml:space="preserve"> </w:t>
+      </w:r>
+      <w:r>
+        <w:t xml:space="preserve">-</w:t>
+      </w:r>
+      <w:r>
+        <w:t xml:space="preserve"> </w:t>
+      </w:r>
+      <w:r>
+        <w:rPr>
+          <w:bCs/>
+          <w:b/>
+        </w:rPr>
+        <w:t xml:space="preserve">Reduksjon i Ledetid:</w:t>
+      </w:r>
+      <w:r>
+        <w:t xml:space="preserve"> </w:t>
+      </w:r>
+      <w:r>
+        <w:t xml:space="preserve">10.79%</w:t>
+      </w:r>
+      <w:r>
+        <w:t xml:space="preserve"> </w:t>
+      </w:r>
+      <w:r>
+        <w:t xml:space="preserve">-</w:t>
+      </w:r>
+      <w:r>
+        <w:t xml:space="preserve"> </w:t>
+      </w:r>
+      <w:r>
+        <w:rPr>
+          <w:bCs/>
+          <w:b/>
+        </w:rPr>
+        <w:t xml:space="preserve">Efficiency Ratio:</w:t>
+      </w:r>
+      <w:r>
+        <w:t xml:space="preserve"> </w:t>
+      </w:r>
+      <w:r>
+        <w:t xml:space="preserve">0.2320</w:t>
       </w:r>
     </w:p>
     <w:p>
@@ -844,18 +1015,18 @@
           <wp:inline>
             <wp:extent cx="5334000" cy="3200400"/>
             <wp:effectExtent b="0" l="0" r="0" t="0"/>
-            <wp:docPr descr="Figur 3: Forholdet mellom økte transportkostnader og oppnådd tidsbesparelse." title="" id="42" name="Picture"/>
+            <wp:docPr descr="Figur 3: Forholdet mellom økte transportkostnader og oppnådd tidsbesparelse." title="" id="44" name="Picture"/>
             <a:graphic>
               <a:graphicData uri="http://schemas.openxmlformats.org/drawingml/2006/picture">
                 <pic:pic>
                   <pic:nvPicPr>
-                    <pic:cNvPr descr="005%20report/figures/cost_leadtime_tradeoff.png" id="43" name="Picture"/>
+                    <pic:cNvPr descr="005%20report/figures/cost_leadtime_tradeoff.png" id="45" name="Picture"/>
                     <pic:cNvPicPr>
                       <a:picLocks noChangeArrowheads="1" noChangeAspect="1"/>
                     </pic:cNvPicPr>
                   </pic:nvPicPr>
                   <pic:blipFill>
-                    <a:blip r:embed="rId41"/>
+                    <a:blip r:embed="rId43"/>
                     <a:stretch>
                       <a:fillRect/>
                     </a:stretch>
@@ -890,9 +1061,9 @@
         <w:t xml:space="preserve">Figur 3: Forholdet mellom økte transportkostnader og oppnådd tidsbesparelse.</w:t>
       </w:r>
     </w:p>
-    <w:bookmarkEnd w:id="44"/>
-    <w:bookmarkEnd w:id="45"/>
-    <w:bookmarkStart w:id="49" w:name="resultat"/>
+    <w:bookmarkEnd w:id="46"/>
+    <w:bookmarkEnd w:id="47"/>
+    <w:bookmarkStart w:id="51" w:name="resultat"/>
     <w:p>
       <w:pPr>
         <w:pStyle w:val="Heading1"/>
@@ -1062,18 +1233,18 @@
           <wp:inline>
             <wp:extent cx="5334000" cy="2667000"/>
             <wp:effectExtent b="0" l="0" r="0" t="0"/>
-            <wp:docPr descr="Figur 1: Fordeling av restitusjonstid på tvers av ulike industrier." title="" id="47" name="Picture"/>
+            <wp:docPr descr="Figur 1: Fordeling av restitusjonstid på tvers av ulike industrier." title="" id="49" name="Picture"/>
             <a:graphic>
               <a:graphicData uri="http://schemas.openxmlformats.org/drawingml/2006/picture">
                 <pic:pic>
                   <pic:nvPicPr>
-                    <pic:cNvPr descr="005%20report/figures/recovery_by_industry.png" id="48" name="Picture"/>
+                    <pic:cNvPr descr="005%20report/figures/recovery_by_industry.png" id="50" name="Picture"/>
                     <pic:cNvPicPr>
                       <a:picLocks noChangeArrowheads="1" noChangeAspect="1"/>
                     </pic:cNvPicPr>
                   </pic:nvPicPr>
                   <pic:blipFill>
-                    <a:blip r:embed="rId46"/>
+                    <a:blip r:embed="rId48"/>
                     <a:stretch>
                       <a:fillRect/>
                     </a:stretch>
@@ -1108,8 +1279,8 @@
         <w:t xml:space="preserve">Figur 1: Fordeling av restitusjonstid på tvers av ulike industrier.</w:t>
       </w:r>
     </w:p>
-    <w:bookmarkEnd w:id="49"/>
-    <w:bookmarkStart w:id="50" w:name="diskusjon"/>
+    <w:bookmarkEnd w:id="51"/>
+    <w:bookmarkStart w:id="52" w:name="diskusjon"/>
     <w:p>
       <w:pPr>
         <w:pStyle w:val="Heading1"/>
@@ -1141,7 +1312,7 @@
         <w:t xml:space="preserve"> </w:t>
       </w:r>
       <w:r>
-        <w:t xml:space="preserve">på 0.2423 antyder at tidsbesparelsen kommer med en betydelig kostnad, men for kritiske bransjer som farmasi er dette ofte akseptabelt for å unngå</w:t>
+        <w:t xml:space="preserve">på 0.2320 antyder at tidsbesparelsen kommer med en betydelig kostnad. Dette skyldes i stor grad den høye prisen på flyfrakt (7x sjøfrakt). For kritiske bransjer som farmasi og luftfart (Aerospace) er dette ofte akseptabelt for å unngå produksjonsstans, mens det for</w:t>
       </w:r>
       <w:r>
         <w:t xml:space="preserve"> </w:t>
@@ -1150,17 +1321,20 @@
         <w:t xml:space="preserve">“</w:t>
       </w:r>
       <w:r>
-        <w:t xml:space="preserve">stock-outs</w:t>
+        <w:t xml:space="preserve">Consumer Goods</w:t>
       </w:r>
       <w:r>
         <w:t xml:space="preserve">”</w:t>
       </w:r>
       <w:r>
-        <w:t xml:space="preserve">.</w:t>
-      </w:r>
-    </w:p>
-    <w:bookmarkEnd w:id="50"/>
-    <w:bookmarkStart w:id="51" w:name="konklusjon"/>
+        <w:t xml:space="preserve"> </w:t>
+      </w:r>
+      <w:r>
+        <w:t xml:space="preserve">kan være mer lønnsomt å akseptere forsinkelser.</w:t>
+      </w:r>
+    </w:p>
+    <w:bookmarkEnd w:id="52"/>
+    <w:bookmarkStart w:id="53" w:name="konklusjon"/>
     <w:p>
       <w:pPr>
         <w:pStyle w:val="Heading1"/>
@@ -1174,11 +1348,11 @@
         <w:pStyle w:val="FirstParagraph"/>
       </w:pPr>
       <w:r>
-        <w:t xml:space="preserve">Beslutningsverktøyet fungerer etter hensikten og gir proaktive råd under kriser. Fremtidig arbeid bør inkludere mer detaljerte kostnadsdata og integrasjon av sanntids-værdata.</w:t>
-      </w:r>
-    </w:p>
-    <w:bookmarkEnd w:id="51"/>
-    <w:bookmarkStart w:id="52" w:name="bibliografi"/>
+        <w:t xml:space="preserve">Beslutningsverktøyet fungerer etter hensikten og gir proaktive råd under kriser. Fremtidig arbeid bør inkludere mer detaljerte kostnadsdata og integrasjon av sanntids-værdata for enda mer presise prediksjoner.</w:t>
+      </w:r>
+    </w:p>
+    <w:bookmarkEnd w:id="53"/>
+    <w:bookmarkStart w:id="54" w:name="bibliografi"/>
     <w:p>
       <w:pPr>
         <w:pStyle w:val="Heading1"/>
@@ -1191,37 +1365,127 @@
       <w:pPr>
         <w:pStyle w:val="FirstParagraph"/>
       </w:pPr>
+      <w:r>
+        <w:t xml:space="preserve">Choi, T. M. (2020). Innovative</w:t>
+      </w:r>
+      <w:r>
+        <w:t xml:space="preserve"> </w:t>
+      </w:r>
+      <w:r>
+        <w:t xml:space="preserve">“</w:t>
+      </w:r>
+      <w:r>
+        <w:t xml:space="preserve">bring-service-near-to-customer</w:t>
+      </w:r>
+      <w:r>
+        <w:t xml:space="preserve">”</w:t>
+      </w:r>
+      <w:r>
+        <w:t xml:space="preserve"> </w:t>
+      </w:r>
+      <w:r>
+        <w:t xml:space="preserve">operations under Corona-Virus (COVID-19) crisis: Lessons from Hong Kong.</w:t>
+      </w:r>
+      <w:r>
+        <w:t xml:space="preserve"> </w:t>
+      </w:r>
       <w:r>
         <w:rPr>
           <w:iCs/>
           <w:i/>
         </w:rPr>
-        <w:t xml:space="preserve">(Referanser i APA 7th stil vil bli lagt til her.)</w:t>
-      </w:r>
-    </w:p>
-    <w:bookmarkEnd w:id="52"/>
-    <w:bookmarkStart w:id="53" w:name="vedlegg"/>
-    <w:p>
-      <w:pPr>
-        <w:pStyle w:val="Heading1"/>
-      </w:pPr>
-      <w:r>
-        <w:t xml:space="preserve">12.0 Vedlegg</w:t>
-      </w:r>
-    </w:p>
-    <w:p>
-      <w:pPr>
-        <w:pStyle w:val="FirstParagraph"/>
-      </w:pPr>
+        <w:t xml:space="preserve">Annals of Operations Research</w:t>
+      </w:r>
+      <w:r>
+        <w:t xml:space="preserve">, 1-25.</w:t>
+      </w:r>
+    </w:p>
+    <w:p>
+      <w:pPr>
+        <w:pStyle w:val="BodyText"/>
+      </w:pPr>
+      <w:r>
+        <w:t xml:space="preserve">Hosseini, S., Ivanov, D., &amp; Dolgui, A. (2019). Review of quantitative methods for supply chain resilience analysis.</w:t>
+      </w:r>
+      <w:r>
+        <w:t xml:space="preserve"> </w:t>
+      </w:r>
       <w:r>
         <w:rPr>
           <w:iCs/>
           <w:i/>
         </w:rPr>
+        <w:t xml:space="preserve">Transportation Research Part E: Logistics and Transportation Review</w:t>
+      </w:r>
+      <w:r>
+        <w:t xml:space="preserve">, 125, 285-307.</w:t>
+      </w:r>
+    </w:p>
+    <w:p>
+      <w:pPr>
+        <w:pStyle w:val="BodyText"/>
+      </w:pPr>
+      <w:r>
+        <w:t xml:space="preserve">Ivanov, D. (2021). Supply chain viability and the post-pandemic digital twin.</w:t>
+      </w:r>
+      <w:r>
+        <w:t xml:space="preserve"> </w:t>
+      </w:r>
+      <w:r>
+        <w:rPr>
+          <w:iCs/>
+          <w:i/>
+        </w:rPr>
+        <w:t xml:space="preserve">International Journal of Production Research</w:t>
+      </w:r>
+      <w:r>
+        <w:t xml:space="preserve">, 59(12), 3530-3542.</w:t>
+      </w:r>
+    </w:p>
+    <w:p>
+      <w:pPr>
+        <w:pStyle w:val="BodyText"/>
+      </w:pPr>
+      <w:r>
+        <w:t xml:space="preserve">Ponomarov, S. Y., &amp; Holcomb, M. C. (2009). Understanding the concept of supply chain resilience.</w:t>
+      </w:r>
+      <w:r>
+        <w:t xml:space="preserve"> </w:t>
+      </w:r>
+      <w:r>
+        <w:rPr>
+          <w:iCs/>
+          <w:i/>
+        </w:rPr>
+        <w:t xml:space="preserve">The International Journal of Logistics Management</w:t>
+      </w:r>
+      <w:r>
+        <w:t xml:space="preserve">, 20(1), 124-143.</w:t>
+      </w:r>
+    </w:p>
+    <w:bookmarkEnd w:id="54"/>
+    <w:bookmarkStart w:id="55" w:name="vedlegg"/>
+    <w:p>
+      <w:pPr>
+        <w:pStyle w:val="Heading1"/>
+      </w:pPr>
+      <w:r>
+        <w:t xml:space="preserve">12.0 Vedlegg</w:t>
+      </w:r>
+    </w:p>
+    <w:p>
+      <w:pPr>
+        <w:pStyle w:val="FirstParagraph"/>
+      </w:pPr>
+      <w:r>
+        <w:rPr>
+          <w:iCs/>
+          <w:i/>
+        </w:rPr>
         <w:t xml:space="preserve">(Eventuelle kildekoder eller utvidede tabeller.)</w:t>
       </w:r>
     </w:p>
-    <w:bookmarkEnd w:id="53"/>
+    <w:bookmarkEnd w:id="55"/>
     <w:sectPr/>
   </w:body>
 </w:document>

</xml_diff>

<commit_message>
Flettet innhold fra fullstendig Word-rapport (ekskludert store filer)
</commit_message>
<xml_diff>
--- a/014 fase 4 - report/Prosjektrapport_LOG650_G07.docx
+++ b/014 fase 4 - report/Prosjektrapport_LOG650_G07.docx
@@ -113,7 +113,7 @@
     </w:p>
     <w:bookmarkEnd w:id="21"/>
     <w:bookmarkEnd w:id="22"/>
-    <w:bookmarkStart w:id="26" w:name="innledning"/>
+    <w:bookmarkStart w:id="25" w:name="innledning"/>
     <w:p>
       <w:pPr>
         <w:pStyle w:val="Heading1"/>
@@ -127,7 +127,7 @@
         <w:pStyle w:val="FirstParagraph"/>
       </w:pPr>
       <w:r>
-        <w:t xml:space="preserve">Introduksjonen beskriver bakgrunnen for prosjektet og behovet for mer robuste beslutningsverktøy i moderne logistikk.</w:t>
+        <w:t xml:space="preserve">Globale forsyningskjeder har de siste årene blitt stadig mer komplekse og sårbare. Hendelser som pandemier, geopolitisk uro og logistiske flaskehalser har vist hvor raskt en forstyrrelse kan spre seg gjennom hele verdikjeden. Dette har økt behovet for bedre verktøy som kan identifisere risiko og støtte beslutninger i situasjoner der leveranser står i fare. Formålet med dette prosjektet er å undersøke hvordan datadrevne metoder kan brukes til å styrke robustheten i forsyningskjeder.</w:t>
       </w:r>
     </w:p>
     <w:bookmarkStart w:id="23" w:name="problemstilling"/>
@@ -148,13 +148,13 @@
       </w:r>
     </w:p>
     <w:bookmarkEnd w:id="23"/>
-    <w:bookmarkStart w:id="24" w:name="avgrensinger"/>
+    <w:bookmarkStart w:id="24" w:name="prosjektets-mål"/>
     <w:p>
       <w:pPr>
         <w:pStyle w:val="Heading2"/>
       </w:pPr>
       <w:r>
-        <w:t xml:space="preserve">1.3 Avgrensinger</w:t>
+        <w:t xml:space="preserve">1.2 Prosjektets mål</w:t>
       </w:r>
     </w:p>
     <w:p>
@@ -162,17 +162,43 @@
         <w:pStyle w:val="FirstParagraph"/>
       </w:pPr>
       <w:r>
-        <w:t xml:space="preserve">Prosjektet fokuserer på risikostyring og robusthet i en forenklet forsyningskjede. Analysen baseres på åpne datasett som beskriver logistiske avvik og historisk restitusjonstid. Prosjektet er avgrenset til vareflyten mellom ett sentrallager og et begrenset antall distribusjonspunkter, med fokus på eksterne risikohendelser.</w:t>
+        <w:t xml:space="preserve">Ved å kombinere maskinlæring og regelbasert beslutningslogikk undersøker vi hvordan virksomheter kan reagere raskere og mer strukturert på forstyrrelser. Prosjektet tar utgangspunkt i sentrale prinsipper innen logistikk og supply chain management, hvor det er en kontinuerlig avveining mellom kostnadseffektivitet og leveringssikkerhet.</w:t>
       </w:r>
     </w:p>
     <w:bookmarkEnd w:id="24"/>
-    <w:bookmarkStart w:id="25" w:name="antagelser"/>
+    <w:bookmarkEnd w:id="25"/>
+    <w:bookmarkStart w:id="27" w:name="omfang-og-prosjektbeskrivelse"/>
+    <w:p>
+      <w:pPr>
+        <w:pStyle w:val="Heading1"/>
+      </w:pPr>
+      <w:r>
+        <w:t xml:space="preserve">2.0 Omfang og prosjektbeskrivelse</w:t>
+      </w:r>
+    </w:p>
+    <w:p>
+      <w:pPr>
+        <w:pStyle w:val="FirstParagraph"/>
+      </w:pPr>
+      <w:r>
+        <w:t xml:space="preserve">Prosjektet er avgrenset til analyse av vareflyt mellom ett sentrallager og et begrenset distribusjonsnettverk. Fokus er rettet mot eksterne risikohendelser som påvirker transport og leverandørtilgang.</w:t>
+      </w:r>
+    </w:p>
+    <w:p>
+      <w:pPr>
+        <w:pStyle w:val="BodyText"/>
+      </w:pPr>
+      <w:r>
+        <w:t xml:space="preserve">Det utviklede beslutningsverktøyet er designet for å håndtere situasjoner der forsyningskjeden blir forstyrret, og skal kunne foreslå tiltak som valg av alternative transportruter, bruk av backup-leverandører og re-allokering av varer mellom distribusjonspunkter. Prosjektet er gjennomført som et forskningsprosjekt basert på åpne datasett og simulert data, noe som gir et generelt bilde av hvordan slike modeller kan fungere i praksis.</w:t>
+      </w:r>
+    </w:p>
+    <w:bookmarkStart w:id="26" w:name="antagelser"/>
     <w:p>
       <w:pPr>
         <w:pStyle w:val="Heading2"/>
       </w:pPr>
       <w:r>
-        <w:t xml:space="preserve">1.4 Antagelser</w:t>
+        <w:t xml:space="preserve">2.1 Antagelser</w:t>
       </w:r>
     </w:p>
     <w:p>
@@ -211,15 +237,15 @@
         <w:t xml:space="preserve">Vi antar at kostnadene for flyfrakt er ca. 7 ganger høyere enn sjøfrakt per enhet.</w:t>
       </w:r>
     </w:p>
-    <w:bookmarkEnd w:id="25"/>
     <w:bookmarkEnd w:id="26"/>
-    <w:bookmarkStart w:id="27" w:name="litteratur"/>
+    <w:bookmarkEnd w:id="27"/>
+    <w:bookmarkStart w:id="28" w:name="litteratur"/>
     <w:p>
       <w:pPr>
         <w:pStyle w:val="Heading1"/>
       </w:pPr>
       <w:r>
-        <w:t xml:space="preserve">2.0 Litteratur</w:t>
+        <w:t xml:space="preserve">3.0 Litteratur</w:t>
       </w:r>
     </w:p>
     <w:p>
@@ -248,14 +274,14 @@
         <w:t xml:space="preserve">(levedyktighet) i en forsyningskjede avhenger av evnen til rask re-konfigurering. Forskning av Hosseini et al. (2019) peker på at backup-leverandører er den mest effektive strategien for å redusere restitusjonstid. Videre har studier av Choi (2020) vist at sanntids beslutningsstøtte kan redusere økonomiske tap med opptil 30% under globale kriser som COVID-19.</w:t>
       </w:r>
     </w:p>
-    <w:bookmarkEnd w:id="27"/>
-    <w:bookmarkStart w:id="30" w:name="teori"/>
+    <w:bookmarkEnd w:id="28"/>
+    <w:bookmarkStart w:id="31" w:name="teori"/>
     <w:p>
       <w:pPr>
         <w:pStyle w:val="Heading1"/>
       </w:pPr>
       <w:r>
-        <w:t xml:space="preserve">3.0 Teori</w:t>
+        <w:t xml:space="preserve">4.0 Teori</w:t>
       </w:r>
     </w:p>
     <w:p>
@@ -263,7 +289,7 @@
         <w:pStyle w:val="FirstParagraph"/>
       </w:pPr>
       <w:r>
-        <w:t xml:space="preserve">Prosjektet bygger på teorien om</w:t>
+        <w:t xml:space="preserve">Risikostyring i forsyningskjeder handler om å identifisere, analysere og håndtere hendelser som kan påvirke flyten av varer og tjenester. I litteraturen skilles det ofte mellom to hovedtyper risiko:</w:t>
       </w:r>
       <w:r>
         <w:t xml:space="preserve"> </w:t>
@@ -273,75 +299,13 @@
           <w:iCs/>
           <w:i/>
         </w:rPr>
-        <w:t xml:space="preserve">Supply Chain Resilience</w:t>
-      </w:r>
-      <w:r>
-        <w:t xml:space="preserve"> </w:t>
-      </w:r>
-      <w:r>
-        <w:t xml:space="preserve">(forsyningskjederobusthet), som defineres som evnen til å motstå, tilpasse seg og komme seg etter forstyrrelser (Ponomarov &amp; Holcomb, 2009).</w:t>
-      </w:r>
-    </w:p>
-    <w:bookmarkStart w:id="28" w:name="restitusjonstid-recovery-time"/>
-    <w:p>
-      <w:pPr>
-        <w:pStyle w:val="Heading2"/>
-      </w:pPr>
-      <w:r>
-        <w:t xml:space="preserve">3.1 Restitusjonstid (Recovery Time)</w:t>
-      </w:r>
-    </w:p>
-    <w:p>
-      <w:pPr>
-        <w:pStyle w:val="FirstParagraph"/>
-      </w:pPr>
-      <w:r>
-        <w:t xml:space="preserve">Teoretisk sett følger en disrupsjon en</w:t>
-      </w:r>
-      <w:r>
-        <w:t xml:space="preserve"> </w:t>
-      </w:r>
-      <w:r>
-        <w:t xml:space="preserve">“</w:t>
-      </w:r>
-      <w:r>
-        <w:t xml:space="preserve">triangel-modell</w:t>
-      </w:r>
-      <w:r>
-        <w:t xml:space="preserve">”</w:t>
-      </w:r>
-      <w:r>
-        <w:t xml:space="preserve"> </w:t>
-      </w:r>
-      <w:r>
-        <w:t xml:space="preserve">hvor ytelsen faller brått og gradvis stiger tilbake til normalen. Vår modell predikerer varigheten av denne stigningen (</w:t>
-      </w:r>
-      <w:r>
-        <w:rPr>
-          <w:rStyle w:val="VerbatimChar"/>
-        </w:rPr>
-        <w:t xml:space="preserve">full_recovery_days</w:t>
-      </w:r>
-      <w:r>
-        <w:t xml:space="preserve">).</w:t>
-      </w:r>
-    </w:p>
-    <w:bookmarkEnd w:id="28"/>
-    <w:bookmarkStart w:id="29" w:name="beslutningsteori-under-usikkerhet"/>
-    <w:p>
-      <w:pPr>
-        <w:pStyle w:val="Heading2"/>
-      </w:pPr>
-      <w:r>
-        <w:t xml:space="preserve">3.2 Beslutningsteori under usikkerhet</w:t>
-      </w:r>
-    </w:p>
-    <w:p>
-      <w:pPr>
-        <w:pStyle w:val="FirstParagraph"/>
-      </w:pPr>
-      <w:r>
-        <w:t xml:space="preserve">Vi benytter</w:t>
+        <w:t xml:space="preserve">disruption risk</w:t>
+      </w:r>
+      <w:r>
+        <w:t xml:space="preserve"> </w:t>
+      </w:r>
+      <w:r>
+        <w:t xml:space="preserve">og</w:t>
       </w:r>
       <w:r>
         <w:t xml:space="preserve"> </w:t>
@@ -351,34 +315,115 @@
           <w:iCs/>
           <w:i/>
         </w:rPr>
+        <w:t xml:space="preserve">operational risk</w:t>
+      </w:r>
+      <w:r>
+        <w:t xml:space="preserve">.</w:t>
+      </w:r>
+    </w:p>
+    <w:p>
+      <w:pPr>
+        <w:pStyle w:val="BodyText"/>
+      </w:pPr>
+      <w:r>
+        <w:t xml:space="preserve">Prosjektet bygger på teorien om</w:t>
+      </w:r>
+      <w:r>
+        <w:t xml:space="preserve"> </w:t>
+      </w:r>
+      <w:r>
+        <w:rPr>
+          <w:iCs/>
+          <w:i/>
+        </w:rPr>
+        <w:t xml:space="preserve">Supply Chain Resilience</w:t>
+      </w:r>
+      <w:r>
+        <w:t xml:space="preserve"> </w:t>
+      </w:r>
+      <w:r>
+        <w:t xml:space="preserve">(forsyningskjederobusthet), som defineres som evnen til å motstå, tilpasse seg og komme seg etter forstyrrelser (Ponomarov &amp; Holcomb, 2009).</w:t>
+      </w:r>
+    </w:p>
+    <w:bookmarkStart w:id="29" w:name="restitusjonstid-recovery-time"/>
+    <w:p>
+      <w:pPr>
+        <w:pStyle w:val="Heading2"/>
+      </w:pPr>
+      <w:r>
+        <w:t xml:space="preserve">4.1 Restitusjonstid (Recovery Time)</w:t>
+      </w:r>
+    </w:p>
+    <w:p>
+      <w:pPr>
+        <w:pStyle w:val="FirstParagraph"/>
+      </w:pPr>
+      <w:r>
+        <w:t xml:space="preserve">Teoretisk sett følger en disrupsjon en</w:t>
+      </w:r>
+      <w:r>
+        <w:t xml:space="preserve"> </w:t>
+      </w:r>
+      <w:r>
+        <w:t xml:space="preserve">“</w:t>
+      </w:r>
+      <w:r>
+        <w:t xml:space="preserve">triangel-modell</w:t>
+      </w:r>
+      <w:r>
+        <w:t xml:space="preserve">”</w:t>
+      </w:r>
+      <w:r>
+        <w:t xml:space="preserve"> </w:t>
+      </w:r>
+      <w:r>
+        <w:t xml:space="preserve">hvor ytelsen faller brått og gradvis stiger tilbake til normalen. Vår modell predikerer varigheten av denne stigningen (</w:t>
+      </w:r>
+      <w:r>
+        <w:rPr>
+          <w:rStyle w:val="VerbatimChar"/>
+        </w:rPr>
+        <w:t xml:space="preserve">full_recovery_days</w:t>
+      </w:r>
+      <w:r>
+        <w:t xml:space="preserve">).</w:t>
+      </w:r>
+    </w:p>
+    <w:bookmarkEnd w:id="29"/>
+    <w:bookmarkStart w:id="30" w:name="beslutningsteori-under-usikkerhet"/>
+    <w:p>
+      <w:pPr>
+        <w:pStyle w:val="Heading2"/>
+      </w:pPr>
+      <w:r>
+        <w:t xml:space="preserve">4.2 Beslutningsteori under usikkerhet</w:t>
+      </w:r>
+    </w:p>
+    <w:p>
+      <w:pPr>
+        <w:pStyle w:val="FirstParagraph"/>
+      </w:pPr>
+      <w:r>
+        <w:t xml:space="preserve">Vi benytter</w:t>
+      </w:r>
+      <w:r>
+        <w:t xml:space="preserve"> </w:t>
+      </w:r>
+      <w:r>
+        <w:rPr>
+          <w:iCs/>
+          <w:i/>
+        </w:rPr>
         <w:t xml:space="preserve">Bounded Rationality</w:t>
       </w:r>
       <w:r>
         <w:t xml:space="preserve"> </w:t>
       </w:r>
       <w:r>
-        <w:t xml:space="preserve">(begrenset rasjonalitet) som teoretisk rammeverk, hvor algoritmen hjelper beslutningstakere med å navigere i komplekse valgmuligheter basert på objektive terskelverdier for risiko og kostnad.</w:t>
-      </w:r>
-    </w:p>
-    <w:bookmarkEnd w:id="29"/>
+        <w:t xml:space="preserve">(begrenset rasjonalitet) som teoretisk rammeverk, hvor algoritmen hjelper beslutningstakere med å navigere i komplekse valgmuligheter basert på objektive terskelverdier for risiko og kostnad. Dette danner grunnlag for prioritering av tiltak.</w:t>
+      </w:r>
+    </w:p>
     <w:bookmarkEnd w:id="30"/>
-    <w:bookmarkStart w:id="31" w:name="casebeskrivelse"/>
-    <w:p>
-      <w:pPr>
-        <w:pStyle w:val="Heading1"/>
-      </w:pPr>
-      <w:r>
-        <w:t xml:space="preserve">4.0 Casebeskrivelse</w:t>
-      </w:r>
-    </w:p>
-    <w:p>
-      <w:pPr>
-        <w:pStyle w:val="FirstParagraph"/>
-      </w:pPr>
-      <w:r>
-        <w:t xml:space="preserve">Casestudien tar utgangspunkt i en global forsyningskjede som frakter varer fra Asia til Europa og Amerika via kritiske ruter som Suez-kanalen og Stillehavet. Problemet omhandler hvordan man skal håndtere uforutsette hendelser som cyberangrep, geopolitiske konflikter og naturkatastrofer som blokkerer disse rutene.</w:t>
-      </w:r>
-    </w:p>
     <w:bookmarkEnd w:id="31"/>
     <w:bookmarkStart w:id="34" w:name="metode-og-data"/>
     <w:p>
@@ -403,13 +448,13 @@
         <w:pStyle w:val="FirstParagraph"/>
       </w:pPr>
       <w:r>
-        <w:t xml:space="preserve">Prosjektet benytter en kvantitativ metode basert på case-studie design.</w:t>
-      </w:r>
-      <w:r>
-        <w:t xml:space="preserve"> </w:t>
-      </w:r>
-      <w:r>
-        <w:t xml:space="preserve">-</w:t>
+        <w:t xml:space="preserve">Prosjektet benytter en kvantitativ metode basert på case-studie design. Det er utviklet en strukturert databehandlings- og modellpipeline i Python:</w:t>
+      </w:r>
+      <w:r>
+        <w:t xml:space="preserve"> </w:t>
+      </w:r>
+      <w:r>
+        <w:t xml:space="preserve">1.</w:t>
       </w:r>
       <w:r>
         <w:t xml:space="preserve"> </w:t>
@@ -419,19 +464,58 @@
           <w:bCs/>
           <w:b/>
         </w:rPr>
-        <w:t xml:space="preserve">Forskingsperspektiv:</w:t>
-      </w:r>
-      <w:r>
-        <w:t xml:space="preserve"> </w:t>
-      </w:r>
-      <w:r>
-        <w:t xml:space="preserve">Deskriptiv og prediktiv analyse.</w:t>
-      </w:r>
-      <w:r>
-        <w:t xml:space="preserve"> </w:t>
-      </w:r>
-      <w:r>
-        <w:t xml:space="preserve">-</w:t>
+        <w:t xml:space="preserve">Datarensing og validering:</w:t>
+      </w:r>
+      <w:r>
+        <w:t xml:space="preserve"> </w:t>
+      </w:r>
+      <w:r>
+        <w:t xml:space="preserve">Gjennomført via</w:t>
+      </w:r>
+      <w:r>
+        <w:t xml:space="preserve"> </w:t>
+      </w:r>
+      <w:r>
+        <w:rPr>
+          <w:rStyle w:val="VerbatimChar"/>
+        </w:rPr>
+        <w:t xml:space="preserve">clean_data.py</w:t>
+      </w:r>
+      <w:r>
+        <w:t xml:space="preserve">,</w:t>
+      </w:r>
+      <w:r>
+        <w:t xml:space="preserve"> </w:t>
+      </w:r>
+      <w:r>
+        <w:rPr>
+          <w:rStyle w:val="VerbatimChar"/>
+        </w:rPr>
+        <w:t xml:space="preserve">data_check.py</w:t>
+      </w:r>
+      <w:r>
+        <w:t xml:space="preserve"> </w:t>
+      </w:r>
+      <w:r>
+        <w:t xml:space="preserve">og</w:t>
+      </w:r>
+      <w:r>
+        <w:t xml:space="preserve"> </w:t>
+      </w:r>
+      <w:r>
+        <w:rPr>
+          <w:rStyle w:val="VerbatimChar"/>
+        </w:rPr>
+        <w:t xml:space="preserve">consistency_check.py</w:t>
+      </w:r>
+      <w:r>
+        <w:t xml:space="preserve">.</w:t>
+      </w:r>
+      <w:r>
+        <w:t xml:space="preserve"> </w:t>
+      </w:r>
+      <w:r>
+        <w:t xml:space="preserve">2.</w:t>
       </w:r>
       <w:r>
         <w:t xml:space="preserve"> </w:t>
@@ -441,19 +525,46 @@
           <w:bCs/>
           <w:b/>
         </w:rPr>
-        <w:t xml:space="preserve">Analysemetoder:</w:t>
-      </w:r>
-      <w:r>
-        <w:t xml:space="preserve"> </w:t>
-      </w:r>
-      <w:r>
-        <w:t xml:space="preserve">Statistisk regresjon for prediksjon og regelbaserte algoritmer for beslutningsstøtte.</w:t>
-      </w:r>
-      <w:r>
-        <w:t xml:space="preserve"> </w:t>
-      </w:r>
-      <w:r>
-        <w:t xml:space="preserve">-</w:t>
+        <w:t xml:space="preserve">Feature Engineering:</w:t>
+      </w:r>
+      <w:r>
+        <w:t xml:space="preserve"> </w:t>
+      </w:r>
+      <w:r>
+        <w:t xml:space="preserve">Relevante variabler som</w:t>
+      </w:r>
+      <w:r>
+        <w:t xml:space="preserve"> </w:t>
+      </w:r>
+      <w:r>
+        <w:rPr>
+          <w:rStyle w:val="VerbatimChar"/>
+        </w:rPr>
+        <w:t xml:space="preserve">Total Risk Index</w:t>
+      </w:r>
+      <w:r>
+        <w:t xml:space="preserve"> </w:t>
+      </w:r>
+      <w:r>
+        <w:t xml:space="preserve">konstrueres i</w:t>
+      </w:r>
+      <w:r>
+        <w:t xml:space="preserve"> </w:t>
+      </w:r>
+      <w:r>
+        <w:rPr>
+          <w:rStyle w:val="VerbatimChar"/>
+        </w:rPr>
+        <w:t xml:space="preserve">feature_engineering.py</w:t>
+      </w:r>
+      <w:r>
+        <w:t xml:space="preserve">.</w:t>
+      </w:r>
+      <w:r>
+        <w:t xml:space="preserve"> </w:t>
+      </w:r>
+      <w:r>
+        <w:t xml:space="preserve">3.</w:t>
       </w:r>
       <w:r>
         <w:t xml:space="preserve"> </w:t>
@@ -463,13 +574,71 @@
           <w:bCs/>
           <w:b/>
         </w:rPr>
-        <w:t xml:space="preserve">Verktøy:</w:t>
-      </w:r>
-      <w:r>
-        <w:t xml:space="preserve"> </w:t>
-      </w:r>
-      <w:r>
-        <w:t xml:space="preserve">Python med biblioteker som Pandas, Scikit-learn, Matplotlib og Seaborn.</w:t>
+        <w:t xml:space="preserve">Modellutvikling:</w:t>
+      </w:r>
+      <w:r>
+        <w:t xml:space="preserve"> </w:t>
+      </w:r>
+      <w:r>
+        <w:t xml:space="preserve">Prediksjonsmodell (</w:t>
+      </w:r>
+      <w:r>
+        <w:rPr>
+          <w:rStyle w:val="VerbatimChar"/>
+        </w:rPr>
+        <w:t xml:space="preserve">recovery_prediction_model.py</w:t>
+      </w:r>
+      <w:r>
+        <w:t xml:space="preserve">) og beslutningsmodell (</w:t>
+      </w:r>
+      <w:r>
+        <w:rPr>
+          <w:rStyle w:val="VerbatimChar"/>
+        </w:rPr>
+        <w:t xml:space="preserve">decision_model.py</w:t>
+      </w:r>
+      <w:r>
+        <w:t xml:space="preserve">).</w:t>
+      </w:r>
+      <w:r>
+        <w:t xml:space="preserve"> </w:t>
+      </w:r>
+      <w:r>
+        <w:t xml:space="preserve">4.</w:t>
+      </w:r>
+      <w:r>
+        <w:t xml:space="preserve"> </w:t>
+      </w:r>
+      <w:r>
+        <w:rPr>
+          <w:bCs/>
+          <w:b/>
+        </w:rPr>
+        <w:t xml:space="preserve">Evaluering:</w:t>
+      </w:r>
+      <w:r>
+        <w:t xml:space="preserve"> </w:t>
+      </w:r>
+      <w:r>
+        <w:t xml:space="preserve">Stresstesting (</w:t>
+      </w:r>
+      <w:r>
+        <w:rPr>
+          <w:rStyle w:val="VerbatimChar"/>
+        </w:rPr>
+        <w:t xml:space="preserve">stress_test.py</w:t>
+      </w:r>
+      <w:r>
+        <w:t xml:space="preserve">) og måltallsanalyse (</w:t>
+      </w:r>
+      <w:r>
+        <w:rPr>
+          <w:rStyle w:val="VerbatimChar"/>
+        </w:rPr>
+        <w:t xml:space="preserve">evaluate_objective.py</w:t>
+      </w:r>
+      <w:r>
+        <w:t xml:space="preserve">).</w:t>
       </w:r>
     </w:p>
     <w:bookmarkEnd w:id="32"/>
@@ -487,134 +656,7 @@
         <w:pStyle w:val="FirstParagraph"/>
       </w:pPr>
       <w:r>
-        <w:t xml:space="preserve">Datasettet består av 100 000 observasjoner av logistiske hendelser.</w:t>
-      </w:r>
-      <w:r>
-        <w:t xml:space="preserve"> </w:t>
-      </w:r>
-      <w:r>
-        <w:t xml:space="preserve">-</w:t>
-      </w:r>
-      <w:r>
-        <w:t xml:space="preserve"> </w:t>
-      </w:r>
-      <w:r>
-        <w:rPr>
-          <w:bCs/>
-          <w:b/>
-        </w:rPr>
-        <w:t xml:space="preserve">Datakilder:</w:t>
-      </w:r>
-      <w:r>
-        <w:t xml:space="preserve"> </w:t>
-      </w:r>
-      <w:r>
-        <w:t xml:space="preserve">Syntetiske og åpne datasett for supply chain disruption.</w:t>
-      </w:r>
-      <w:r>
-        <w:t xml:space="preserve"> </w:t>
-      </w:r>
-      <w:r>
-        <w:t xml:space="preserve">-</w:t>
-      </w:r>
-      <w:r>
-        <w:t xml:space="preserve"> </w:t>
-      </w:r>
-      <w:r>
-        <w:rPr>
-          <w:bCs/>
-          <w:b/>
-        </w:rPr>
-        <w:t xml:space="preserve">Cleaning:</w:t>
-      </w:r>
-      <w:r>
-        <w:t xml:space="preserve"> </w:t>
-      </w:r>
-      <w:r>
-        <w:t xml:space="preserve">Data er renset for manglende verdier og inkonsistente rutenavn.</w:t>
-      </w:r>
-      <w:r>
-        <w:t xml:space="preserve"> </w:t>
-      </w:r>
-      <w:r>
-        <w:t xml:space="preserve">-</w:t>
-      </w:r>
-      <w:r>
-        <w:t xml:space="preserve"> </w:t>
-      </w:r>
-      <w:r>
-        <w:rPr>
-          <w:bCs/>
-          <w:b/>
-        </w:rPr>
-        <w:t xml:space="preserve">Feature Engineering:</w:t>
-      </w:r>
-      <w:r>
-        <w:t xml:space="preserve"> </w:t>
-      </w:r>
-      <w:r>
-        <w:t xml:space="preserve">Det er opprettet nye variabler som</w:t>
-      </w:r>
-      <w:r>
-        <w:t xml:space="preserve"> </w:t>
-      </w:r>
-      <w:r>
-        <w:rPr>
-          <w:rStyle w:val="VerbatimChar"/>
-        </w:rPr>
-        <w:t xml:space="preserve">Delay Ratio</w:t>
-      </w:r>
-      <w:r>
-        <w:t xml:space="preserve">,</w:t>
-      </w:r>
-      <w:r>
-        <w:t xml:space="preserve"> </w:t>
-      </w:r>
-      <w:r>
-        <w:rPr>
-          <w:rStyle w:val="VerbatimChar"/>
-        </w:rPr>
-        <w:t xml:space="preserve">Total Risk Index</w:t>
-      </w:r>
-      <w:r>
-        <w:t xml:space="preserve"> </w:t>
-      </w:r>
-      <w:r>
-        <w:t xml:space="preserve">og</w:t>
-      </w:r>
-      <w:r>
-        <w:t xml:space="preserve"> </w:t>
-      </w:r>
-      <w:r>
-        <w:rPr>
-          <w:rStyle w:val="VerbatimChar"/>
-        </w:rPr>
-        <w:t xml:space="preserve">Recovery Speed</w:t>
-      </w:r>
-      <w:r>
-        <w:t xml:space="preserve">.</w:t>
-      </w:r>
-      <w:r>
-        <w:t xml:space="preserve"> </w:t>
-      </w:r>
-      <w:r>
-        <w:t xml:space="preserve">-</w:t>
-      </w:r>
-      <w:r>
-        <w:t xml:space="preserve"> </w:t>
-      </w:r>
-      <w:r>
-        <w:rPr>
-          <w:bCs/>
-          <w:b/>
-        </w:rPr>
-        <w:t xml:space="preserve">Separering:</w:t>
-      </w:r>
-      <w:r>
-        <w:t xml:space="preserve"> </w:t>
-      </w:r>
-      <w:r>
-        <w:t xml:space="preserve">Data er delt i et treningssett (80%) og et testsett (20%).</w:t>
+        <w:t xml:space="preserve">Datasettet består av 100 000 observasjoner av logistiske hendelser. Dataene er delt i et treningssett (80%) og et testsett (20%). Variabler inkluderer forstyrrelsestype, industri, alvorlighetsgrad og geografisk region.</w:t>
       </w:r>
     </w:p>
     <w:bookmarkEnd w:id="33"/>
@@ -784,7 +826,7 @@
         <w:pStyle w:val="Heading2"/>
       </w:pPr>
       <w:r>
-        <w:t xml:space="preserve">6.4 Prediksjonsmodell (2.2.3)</w:t>
+        <w:t xml:space="preserve">6.3 Prediksjonsmodell (2.2.3)</w:t>
       </w:r>
     </w:p>
     <w:p>
@@ -792,7 +834,7 @@
         <w:pStyle w:val="FirstParagraph"/>
       </w:pPr>
       <w:r>
-        <w:t xml:space="preserve">En Random Forest Regressor er trent for å predikere restitusjonstid basert på 17 variabler, inkludert industri, disrupsjonstype og økonomisk risiko.</w:t>
+        <w:t xml:space="preserve">En Random Forest Regressor er trent for å predikere restitusjonstid basert på 17 variabler.</w:t>
       </w:r>
       <w:r>
         <w:t xml:space="preserve"> </w:t>
@@ -864,7 +906,7 @@
         <w:pStyle w:val="FirstParagraph"/>
       </w:pPr>
       <w:r>
-        <w:t xml:space="preserve">Simulering av en total Suez-blokkering (Risiko = 0.95) viser at andelen ordrer som må omrutes eller flyttes til flyfrakt øker drastisk for å opprettholde leveringsdyktighet.</w:t>
+        <w:t xml:space="preserve">Simulering av en total Suez-blokkering (Risiko = 0.95) viser at andelen ordrer som må omrutes øker drastisk for å opprettholde leveringsdyktighet.</w:t>
       </w:r>
     </w:p>
     <w:p>
@@ -937,7 +979,7 @@
         <w:pStyle w:val="FirstParagraph"/>
       </w:pPr>
       <w:r>
-        <w:t xml:space="preserve">Sammenligning av kostnad vs. tidsbesparelse.</w:t>
+        <w:t xml:space="preserve">Sammenligning av kostnad vs. tidsbesparelse:</w:t>
       </w:r>
       <w:r>
         <w:t xml:space="preserve"> </w:t>
@@ -1294,7 +1336,15 @@
         <w:pStyle w:val="FirstParagraph"/>
       </w:pPr>
       <w:r>
-        <w:t xml:space="preserve">Analysen viser en klar trade-off mellom kostnad og ledetid. En</w:t>
+        <w:t xml:space="preserve">Funnene i analysen viser tydelig hvordan ulike typer forstyrrelser påvirker restitusjonstid. Spesielt fremstår cyberangrep og naturkatastrofer som hendelser med høy restitusjonstid, noe som indikerer at disse typene risiko er vanskeligere å håndtere operasjonelt. Dette samsvarer med teori hvor eksterne og lite kontrollerbare hendelser gir størst utslag.</w:t>
+      </w:r>
+    </w:p>
+    <w:p>
+      <w:pPr>
+        <w:pStyle w:val="BodyText"/>
+      </w:pPr>
+      <w:r>
+        <w:t xml:space="preserve">Et sentralt funn er effekten av backup-leverandører. Resultatene viser en betydelig reduksjon i restitusjonstid for selskaper som har alternative leverandører tilgjengelig. Dette illustrerer en klassisk avveining i logistikk: balansen mellom kostnadseffektivitet og leveringssikkerhet. En</w:t>
       </w:r>
       <w:r>
         <w:t xml:space="preserve"> </w:t>
@@ -1312,25 +1362,15 @@
         <w:t xml:space="preserve"> </w:t>
       </w:r>
       <w:r>
-        <w:t xml:space="preserve">på 0.2320 antyder at tidsbesparelsen kommer med en betydelig kostnad. Dette skyldes i stor grad den høye prisen på flyfrakt (7x sjøfrakt). For kritiske bransjer som farmasi og luftfart (Aerospace) er dette ofte akseptabelt for å unngå produksjonsstans, mens det for</w:t>
-      </w:r>
-      <w:r>
-        <w:t xml:space="preserve"> </w:t>
-      </w:r>
-      <w:r>
-        <w:t xml:space="preserve">“</w:t>
-      </w:r>
-      <w:r>
-        <w:t xml:space="preserve">Consumer Goods</w:t>
-      </w:r>
-      <w:r>
-        <w:t xml:space="preserve">”</w:t>
-      </w:r>
-      <w:r>
-        <w:t xml:space="preserve"> </w:t>
-      </w:r>
-      <w:r>
-        <w:t xml:space="preserve">kan være mer lønnsomt å akseptere forsinkelser.</w:t>
+        <w:t xml:space="preserve">på 0.2320 antyder at tidsbesparelsen kommer med en betydelig kostnad, hovedsakelig grunnet flyfrakt. For kritiske bransjer som farmasi og luftfart (Aerospace) er dette ofte akseptabelt for å unngå produksjonsstans.</w:t>
+      </w:r>
+    </w:p>
+    <w:p>
+      <w:pPr>
+        <w:pStyle w:val="BodyText"/>
+      </w:pPr>
+      <w:r>
+        <w:t xml:space="preserve">Modellen har likevel begrensninger. Den er basert på historiske og delvis simulerte data. I virkelige forsyningskjeder vil beslutninger ofte være påvirket av faktorer som kontraktsforhold og politiske forhold. Regresjonsmodellen har også en begrenset forklaringsgrad, noe som tyder på at flere variabler bør inkluderes i fremtidige modeller.</w:t>
       </w:r>
     </w:p>
     <w:bookmarkEnd w:id="52"/>
@@ -1348,7 +1388,7 @@
         <w:pStyle w:val="FirstParagraph"/>
       </w:pPr>
       <w:r>
-        <w:t xml:space="preserve">Beslutningsverktøyet fungerer etter hensikten og gir proaktive råd under kriser. Fremtidig arbeid bør inkludere mer detaljerte kostnadsdata og integrasjon av sanntids-værdata for enda mer presise prediksjoner.</w:t>
+        <w:t xml:space="preserve">Beslutningsverktøyet fungerer etter hensikten og gir proaktive råd under kriser. Ved å kombinere risikoanalyse med konkrete tiltak kan virksomheter redusere konsekvensene av forstyrrelser. Fremtidig arbeid bør inkludere mer detaljerte kostnadsdata, flere nivåer i forsyningskjeden og integrasjon av sanntids-værdata for enda mer presise prediksjoner.</w:t>
       </w:r>
     </w:p>
     <w:bookmarkEnd w:id="53"/>

</xml_diff>

<commit_message>
Fullført sanntidsintegrasjon og oppdatert rapport (ekskludert store filer)
</commit_message>
<xml_diff>
--- a/014 fase 4 - report/Prosjektrapport_LOG650_G07.docx
+++ b/014 fase 4 - report/Prosjektrapport_LOG650_G07.docx
@@ -661,7 +661,7 @@
     </w:p>
     <w:bookmarkEnd w:id="33"/>
     <w:bookmarkEnd w:id="34"/>
-    <w:bookmarkStart w:id="38" w:name="modellering"/>
+    <w:bookmarkStart w:id="39" w:name="modellering"/>
     <w:p>
       <w:pPr>
         <w:pStyle w:val="Heading1"/>
@@ -826,7 +826,7 @@
         <w:pStyle w:val="Heading2"/>
       </w:pPr>
       <w:r>
-        <w:t xml:space="preserve">6.3 Prediksjonsmodell (2.2.3)</w:t>
+        <w:t xml:space="preserve">6.4 Prediksjonsmodell (2.2.3)</w:t>
       </w:r>
     </w:p>
     <w:p>
@@ -882,23 +882,13 @@
       </w:r>
     </w:p>
     <w:bookmarkEnd w:id="37"/>
-    <w:bookmarkEnd w:id="38"/>
-    <w:bookmarkStart w:id="47" w:name="analyse"/>
-    <w:p>
-      <w:pPr>
-        <w:pStyle w:val="Heading1"/>
-      </w:pPr>
-      <w:r>
-        <w:t xml:space="preserve">7.0 Analyse</w:t>
-      </w:r>
-    </w:p>
-    <w:bookmarkStart w:id="42" w:name="stresstesting-2.3.2"/>
+    <w:bookmarkStart w:id="38" w:name="sanntids-risikointegrasjon-ny-funksjon"/>
     <w:p>
       <w:pPr>
         <w:pStyle w:val="Heading2"/>
       </w:pPr>
       <w:r>
-        <w:t xml:space="preserve">7.1 Stresstesting (2.3.2)</w:t>
+        <w:t xml:space="preserve">6.5 Sanntids Risikointegrasjon (Ny funksjon)</w:t>
       </w:r>
     </w:p>
     <w:p>
@@ -906,86 +896,7 @@
         <w:pStyle w:val="FirstParagraph"/>
       </w:pPr>
       <w:r>
-        <w:t xml:space="preserve">Simulering av en total Suez-blokkering (Risiko = 0.95) viser at andelen ordrer som må omrutes øker drastisk for å opprettholde leveringsdyktighet.</w:t>
-      </w:r>
-    </w:p>
-    <w:p>
-      <w:pPr>
-        <w:pStyle w:val="CaptionedFigure"/>
-      </w:pPr>
-      <w:r>
-        <w:drawing>
-          <wp:inline>
-            <wp:extent cx="5334000" cy="2667000"/>
-            <wp:effectExtent b="0" l="0" r="0" t="0"/>
-            <wp:docPr descr="Figur 2: Skifte i beslutningsstrategier ved normal drift vs. global Suez-blokkering." title="" id="40" name="Picture"/>
-            <a:graphic>
-              <a:graphicData uri="http://schemas.openxmlformats.org/drawingml/2006/picture">
-                <pic:pic>
-                  <pic:nvPicPr>
-                    <pic:cNvPr descr="005%20report/figures/stress_test_comparison.png" id="41" name="Picture"/>
-                    <pic:cNvPicPr>
-                      <a:picLocks noChangeArrowheads="1" noChangeAspect="1"/>
-                    </pic:cNvPicPr>
-                  </pic:nvPicPr>
-                  <pic:blipFill>
-                    <a:blip r:embed="rId39"/>
-                    <a:stretch>
-                      <a:fillRect/>
-                    </a:stretch>
-                  </pic:blipFill>
-                  <pic:spPr bwMode="auto">
-                    <a:xfrm>
-                      <a:off x="0" y="0"/>
-                      <a:ext cx="5334000" cy="2667000"/>
-                    </a:xfrm>
-                    <a:prstGeom prst="rect">
-                      <a:avLst/>
-                    </a:prstGeom>
-                    <a:noFill/>
-                    <a:ln w="9525">
-                      <a:noFill/>
-                      <a:headEnd/>
-                      <a:tailEnd/>
-                    </a:ln>
-                  </pic:spPr>
-                </pic:pic>
-              </a:graphicData>
-            </a:graphic>
-          </wp:inline>
-        </w:drawing>
-      </w:r>
-    </w:p>
-    <w:p>
-      <w:pPr>
-        <w:pStyle w:val="ImageCaption"/>
-      </w:pPr>
-      <w:r>
-        <w:t xml:space="preserve">Figur 2: Skifte i beslutningsstrategier ved normal drift vs. global Suez-blokkering.</w:t>
-      </w:r>
-    </w:p>
-    <w:bookmarkEnd w:id="42"/>
-    <w:bookmarkStart w:id="46" w:name="evaluering-av-målfunksjon-2.3.3"/>
-    <w:p>
-      <w:pPr>
-        <w:pStyle w:val="Heading2"/>
-      </w:pPr>
-      <w:r>
-        <w:t xml:space="preserve">7.2 Evaluering av Målfunksjon (2.3.3)</w:t>
-      </w:r>
-    </w:p>
-    <w:p>
-      <w:pPr>
-        <w:pStyle w:val="FirstParagraph"/>
-      </w:pPr>
-      <w:r>
-        <w:t xml:space="preserve">Sammenligning av kostnad vs. tidsbesparelse:</w:t>
-      </w:r>
-      <w:r>
-        <w:t xml:space="preserve"> </w:t>
-      </w:r>
-      <w:r>
-        <w:t xml:space="preserve">-</w:t>
+        <w:t xml:space="preserve">En av prosjektets mest innovative utvidelser er integrasjonen av</w:t>
       </w:r>
       <w:r>
         <w:t xml:space="preserve"> </w:t>
@@ -995,13 +906,10 @@
           <w:bCs/>
           <w:b/>
         </w:rPr>
-        <w:t xml:space="preserve">Kostnadsøkning:</w:t>
-      </w:r>
-      <w:r>
-        <w:t xml:space="preserve"> </w:t>
-      </w:r>
-      <w:r>
-        <w:t xml:space="preserve">46.51%</w:t>
+        <w:t xml:space="preserve">NewsAPI</w:t>
+      </w:r>
+      <w:r>
+        <w:t xml:space="preserve">. Verktøyet henter nå automatisk sanntidsnyheter om globale logistikk-flaskehalser (f.eks. Suez-blokkeringer, ekstremvær eller geopolitiske konflikter).</w:t>
       </w:r>
       <w:r>
         <w:t xml:space="preserve"> </w:t>
@@ -1017,13 +925,26 @@
           <w:bCs/>
           <w:b/>
         </w:rPr>
-        <w:t xml:space="preserve">Reduksjon i Ledetid:</w:t>
-      </w:r>
-      <w:r>
-        <w:t xml:space="preserve"> </w:t>
-      </w:r>
-      <w:r>
-        <w:t xml:space="preserve">10.79%</w:t>
+        <w:t xml:space="preserve">Metodikk:</w:t>
+      </w:r>
+      <w:r>
+        <w:t xml:space="preserve"> </w:t>
+      </w:r>
+      <w:r>
+        <w:t xml:space="preserve">Algoritmen analyserer nyhetsstrømmer og genererer en</w:t>
+      </w:r>
+      <w:r>
+        <w:t xml:space="preserve"> </w:t>
+      </w:r>
+      <w:r>
+        <w:rPr>
+          <w:iCs/>
+          <w:i/>
+        </w:rPr>
+        <w:t xml:space="preserve">Live Risk Score</w:t>
+      </w:r>
+      <w:r>
+        <w:t xml:space="preserve">.</w:t>
       </w:r>
       <w:r>
         <w:t xml:space="preserve"> </w:t>
@@ -1039,73 +960,152 @@
           <w:bCs/>
           <w:b/>
         </w:rPr>
+        <w:t xml:space="preserve">Dynamisk respons:</w:t>
+      </w:r>
+      <w:r>
+        <w:t xml:space="preserve"> </w:t>
+      </w:r>
+      <w:r>
+        <w:t xml:space="preserve">Hvis sanntidsrisikoen for en rute øker (f.eks. Suez), vil beslutningsmodellen automatisk prioritere omruting eller flyfrakt før forsinkelsen faktisk er registrert i interne systemer. Dette flytter verktøyet fra å være reaktivt til å bli proaktivt.</w:t>
+      </w:r>
+    </w:p>
+    <w:bookmarkEnd w:id="38"/>
+    <w:bookmarkEnd w:id="39"/>
+    <w:bookmarkStart w:id="42" w:name="analyse"/>
+    <w:p>
+      <w:pPr>
+        <w:pStyle w:val="Heading1"/>
+      </w:pPr>
+      <w:r>
+        <w:t xml:space="preserve">7.0 Analyse</w:t>
+      </w:r>
+    </w:p>
+    <w:bookmarkStart w:id="40" w:name="stresstesting-2.3.2"/>
+    <w:p>
+      <w:pPr>
+        <w:pStyle w:val="Heading2"/>
+      </w:pPr>
+      <w:r>
+        <w:t xml:space="preserve">7.1 Stresstesting (2.3.2)</w:t>
+      </w:r>
+    </w:p>
+    <w:p>
+      <w:pPr>
+        <w:pStyle w:val="FirstParagraph"/>
+      </w:pPr>
+      <w:r>
+        <w:t xml:space="preserve">…</w:t>
+      </w:r>
+    </w:p>
+    <w:bookmarkEnd w:id="40"/>
+    <w:bookmarkStart w:id="41" w:name="evaluering-av-målfunksjon-2.3.3"/>
+    <w:p>
+      <w:pPr>
+        <w:pStyle w:val="Heading2"/>
+      </w:pPr>
+      <w:r>
+        <w:t xml:space="preserve">7.2 Evaluering av Målfunksjon (2.3.3)</w:t>
+      </w:r>
+    </w:p>
+    <w:p>
+      <w:pPr>
+        <w:pStyle w:val="FirstParagraph"/>
+      </w:pPr>
+      <w:r>
+        <w:t xml:space="preserve">Med sanntidsdata integrert (per 30. april 2026), viser modellen en mer forsiktig tilnærming med økt fokus på risikoreduksjon:</w:t>
+      </w:r>
+      <w:r>
+        <w:t xml:space="preserve"> </w:t>
+      </w:r>
+      <w:r>
+        <w:t xml:space="preserve">-</w:t>
+      </w:r>
+      <w:r>
+        <w:t xml:space="preserve"> </w:t>
+      </w:r>
+      <w:r>
+        <w:rPr>
+          <w:bCs/>
+          <w:b/>
+        </w:rPr>
+        <w:t xml:space="preserve">Kostnadsøkning:</w:t>
+      </w:r>
+      <w:r>
+        <w:t xml:space="preserve"> </w:t>
+      </w:r>
+      <w:r>
+        <w:t xml:space="preserve">61.09%</w:t>
+      </w:r>
+      <w:r>
+        <w:t xml:space="preserve"> </w:t>
+      </w:r>
+      <w:r>
+        <w:t xml:space="preserve">-</w:t>
+      </w:r>
+      <w:r>
+        <w:t xml:space="preserve"> </w:t>
+      </w:r>
+      <w:r>
+        <w:rPr>
+          <w:bCs/>
+          <w:b/>
+        </w:rPr>
+        <w:t xml:space="preserve">Reduksjon i Ledetid:</w:t>
+      </w:r>
+      <w:r>
+        <w:t xml:space="preserve"> </w:t>
+      </w:r>
+      <w:r>
+        <w:t xml:space="preserve">12.09%</w:t>
+      </w:r>
+      <w:r>
+        <w:t xml:space="preserve"> </w:t>
+      </w:r>
+      <w:r>
+        <w:t xml:space="preserve">-</w:t>
+      </w:r>
+      <w:r>
+        <w:t xml:space="preserve"> </w:t>
+      </w:r>
+      <w:r>
+        <w:rPr>
+          <w:bCs/>
+          <w:b/>
+        </w:rPr>
         <w:t xml:space="preserve">Efficiency Ratio:</w:t>
       </w:r>
       <w:r>
         <w:t xml:space="preserve"> </w:t>
       </w:r>
       <w:r>
-        <w:t xml:space="preserve">0.2320</w:t>
-      </w:r>
-    </w:p>
-    <w:p>
-      <w:pPr>
-        <w:pStyle w:val="CaptionedFigure"/>
-      </w:pPr>
-      <w:r>
-        <w:drawing>
-          <wp:inline>
-            <wp:extent cx="5334000" cy="3200400"/>
-            <wp:effectExtent b="0" l="0" r="0" t="0"/>
-            <wp:docPr descr="Figur 3: Forholdet mellom økte transportkostnader og oppnådd tidsbesparelse." title="" id="44" name="Picture"/>
-            <a:graphic>
-              <a:graphicData uri="http://schemas.openxmlformats.org/drawingml/2006/picture">
-                <pic:pic>
-                  <pic:nvPicPr>
-                    <pic:cNvPr descr="005%20report/figures/cost_leadtime_tradeoff.png" id="45" name="Picture"/>
-                    <pic:cNvPicPr>
-                      <a:picLocks noChangeArrowheads="1" noChangeAspect="1"/>
-                    </pic:cNvPicPr>
-                  </pic:nvPicPr>
-                  <pic:blipFill>
-                    <a:blip r:embed="rId43"/>
-                    <a:stretch>
-                      <a:fillRect/>
-                    </a:stretch>
-                  </pic:blipFill>
-                  <pic:spPr bwMode="auto">
-                    <a:xfrm>
-                      <a:off x="0" y="0"/>
-                      <a:ext cx="5334000" cy="3200400"/>
-                    </a:xfrm>
-                    <a:prstGeom prst="rect">
-                      <a:avLst/>
-                    </a:prstGeom>
-                    <a:noFill/>
-                    <a:ln w="9525">
-                      <a:noFill/>
-                      <a:headEnd/>
-                      <a:tailEnd/>
-                    </a:ln>
-                  </pic:spPr>
-                </pic:pic>
-              </a:graphicData>
-            </a:graphic>
-          </wp:inline>
-        </w:drawing>
-      </w:r>
-    </w:p>
-    <w:p>
-      <w:pPr>
-        <w:pStyle w:val="ImageCaption"/>
-      </w:pPr>
-      <w:r>
-        <w:t xml:space="preserve">Figur 3: Forholdet mellom økte transportkostnader og oppnådd tidsbesparelse.</w:t>
-      </w:r>
-    </w:p>
-    <w:bookmarkEnd w:id="46"/>
-    <w:bookmarkEnd w:id="47"/>
-    <w:bookmarkStart w:id="51" w:name="resultat"/>
+        <w:t xml:space="preserve">0.1979</w:t>
+      </w:r>
+      <w:r>
+        <w:t xml:space="preserve"> </w:t>
+      </w:r>
+      <w:r>
+        <w:t xml:space="preserve">-</w:t>
+      </w:r>
+      <w:r>
+        <w:t xml:space="preserve"> </w:t>
+      </w:r>
+      <w:r>
+        <w:rPr>
+          <w:bCs/>
+          <w:b/>
+        </w:rPr>
+        <w:t xml:space="preserve">Strategiendring:</w:t>
+      </w:r>
+      <w:r>
+        <w:t xml:space="preserve"> </w:t>
+      </w:r>
+      <w:r>
+        <w:t xml:space="preserve">Antallet foreslåtte omrutinger via Kapp det gode håp økte betydelig (fra 374 til 2471) som følge av sanntidssignaler om spenninger i Suez-regionen.</w:t>
+      </w:r>
+    </w:p>
+    <w:bookmarkEnd w:id="41"/>
+    <w:bookmarkEnd w:id="42"/>
+    <w:bookmarkStart w:id="46" w:name="resultat"/>
     <w:p>
       <w:pPr>
         <w:pStyle w:val="Heading1"/>
@@ -1275,18 +1275,18 @@
           <wp:inline>
             <wp:extent cx="5334000" cy="2667000"/>
             <wp:effectExtent b="0" l="0" r="0" t="0"/>
-            <wp:docPr descr="Figur 1: Fordeling av restitusjonstid på tvers av ulike industrier." title="" id="49" name="Picture"/>
+            <wp:docPr descr="Figur 1: Fordeling av restitusjonstid på tvers av ulike industrier." title="" id="44" name="Picture"/>
             <a:graphic>
               <a:graphicData uri="http://schemas.openxmlformats.org/drawingml/2006/picture">
                 <pic:pic>
                   <pic:nvPicPr>
-                    <pic:cNvPr descr="005%20report/figures/recovery_by_industry.png" id="50" name="Picture"/>
+                    <pic:cNvPr descr="005%20report/figures/recovery_by_industry.png" id="45" name="Picture"/>
                     <pic:cNvPicPr>
                       <a:picLocks noChangeArrowheads="1" noChangeAspect="1"/>
                     </pic:cNvPicPr>
                   </pic:nvPicPr>
                   <pic:blipFill>
-                    <a:blip r:embed="rId48"/>
+                    <a:blip r:embed="rId43"/>
                     <a:stretch>
                       <a:fillRect/>
                     </a:stretch>
@@ -1321,8 +1321,8 @@
         <w:t xml:space="preserve">Figur 1: Fordeling av restitusjonstid på tvers av ulike industrier.</w:t>
       </w:r>
     </w:p>
-    <w:bookmarkEnd w:id="51"/>
-    <w:bookmarkStart w:id="52" w:name="diskusjon"/>
+    <w:bookmarkEnd w:id="46"/>
+    <w:bookmarkStart w:id="47" w:name="diskusjon"/>
     <w:p>
       <w:pPr>
         <w:pStyle w:val="Heading1"/>
@@ -1373,8 +1373,8 @@
         <w:t xml:space="preserve">Modellen har likevel begrensninger. Den er basert på historiske og delvis simulerte data. I virkelige forsyningskjeder vil beslutninger ofte være påvirket av faktorer som kontraktsforhold og politiske forhold. Regresjonsmodellen har også en begrenset forklaringsgrad, noe som tyder på at flere variabler bør inkluderes i fremtidige modeller.</w:t>
       </w:r>
     </w:p>
-    <w:bookmarkEnd w:id="52"/>
-    <w:bookmarkStart w:id="53" w:name="konklusjon"/>
+    <w:bookmarkEnd w:id="47"/>
+    <w:bookmarkStart w:id="48" w:name="konklusjon"/>
     <w:p>
       <w:pPr>
         <w:pStyle w:val="Heading1"/>
@@ -1391,8 +1391,8 @@
         <w:t xml:space="preserve">Beslutningsverktøyet fungerer etter hensikten og gir proaktive råd under kriser. Ved å kombinere risikoanalyse med konkrete tiltak kan virksomheter redusere konsekvensene av forstyrrelser. Fremtidig arbeid bør inkludere mer detaljerte kostnadsdata, flere nivåer i forsyningskjeden og integrasjon av sanntids-værdata for enda mer presise prediksjoner.</w:t>
       </w:r>
     </w:p>
-    <w:bookmarkEnd w:id="53"/>
-    <w:bookmarkStart w:id="54" w:name="bibliografi"/>
+    <w:bookmarkEnd w:id="48"/>
+    <w:bookmarkStart w:id="49" w:name="bibliografi"/>
     <w:p>
       <w:pPr>
         <w:pStyle w:val="Heading1"/>
@@ -1503,8 +1503,8 @@
         <w:t xml:space="preserve">, 20(1), 124-143.</w:t>
       </w:r>
     </w:p>
-    <w:bookmarkEnd w:id="54"/>
-    <w:bookmarkStart w:id="55" w:name="vedlegg"/>
+    <w:bookmarkEnd w:id="49"/>
+    <w:bookmarkStart w:id="50" w:name="vedlegg"/>
     <w:p>
       <w:pPr>
         <w:pStyle w:val="Heading1"/>
@@ -1525,7 +1525,7 @@
         <w:t xml:space="preserve">(Eventuelle kildekoder eller utvidede tabeller.)</w:t>
       </w:r>
     </w:p>
-    <w:bookmarkEnd w:id="55"/>
+    <w:bookmarkEnd w:id="50"/>
     <w:sectPr/>
   </w:body>
 </w:document>

</xml_diff>

<commit_message>
Integrert sanntids værdata (OpenWeatherMap) og oppdatert rapport (ekskl. store filer)
</commit_message>
<xml_diff>
--- a/014 fase 4 - report/Prosjektrapport_LOG650_G07.docx
+++ b/014 fase 4 - report/Prosjektrapport_LOG650_G07.docx
@@ -909,13 +909,10 @@
         <w:t xml:space="preserve">NewsAPI</w:t>
       </w:r>
       <w:r>
-        <w:t xml:space="preserve">. Verktøyet henter nå automatisk sanntidsnyheter om globale logistikk-flaskehalser (f.eks. Suez-blokkeringer, ekstremvær eller geopolitiske konflikter).</w:t>
-      </w:r>
-      <w:r>
-        <w:t xml:space="preserve"> </w:t>
-      </w:r>
-      <w:r>
-        <w:t xml:space="preserve">-</w:t>
+        <w:t xml:space="preserve"> </w:t>
+      </w:r>
+      <w:r>
+        <w:t xml:space="preserve">og</w:t>
       </w:r>
       <w:r>
         <w:t xml:space="preserve"> </w:t>
@@ -925,26 +922,10 @@
           <w:bCs/>
           <w:b/>
         </w:rPr>
-        <w:t xml:space="preserve">Metodikk:</w:t>
-      </w:r>
-      <w:r>
-        <w:t xml:space="preserve"> </w:t>
-      </w:r>
-      <w:r>
-        <w:t xml:space="preserve">Algoritmen analyserer nyhetsstrømmer og genererer en</w:t>
-      </w:r>
-      <w:r>
-        <w:t xml:space="preserve"> </w:t>
-      </w:r>
-      <w:r>
-        <w:rPr>
-          <w:iCs/>
-          <w:i/>
-        </w:rPr>
-        <w:t xml:space="preserve">Live Risk Score</w:t>
-      </w:r>
-      <w:r>
-        <w:t xml:space="preserve">.</w:t>
+        <w:t xml:space="preserve">OpenWeatherMap API</w:t>
+      </w:r>
+      <w:r>
+        <w:t xml:space="preserve">. Verktøyet henter nå automatisk sanntidsdata for å identifisere trusler før de påvirker forsyningskjeden:</w:t>
       </w:r>
       <w:r>
         <w:t xml:space="preserve"> </w:t>
@@ -960,13 +941,57 @@
           <w:bCs/>
           <w:b/>
         </w:rPr>
+        <w:t xml:space="preserve">Global nyhetsovervåking:</w:t>
+      </w:r>
+      <w:r>
+        <w:t xml:space="preserve"> </w:t>
+      </w:r>
+      <w:r>
+        <w:t xml:space="preserve">Analyserer nyhetsstrømmer for geopolitisk uro, streik og blokkeringer (f.eks. Suez-kanalen).</w:t>
+      </w:r>
+      <w:r>
+        <w:t xml:space="preserve"> </w:t>
+      </w:r>
+      <w:r>
+        <w:t xml:space="preserve">-</w:t>
+      </w:r>
+      <w:r>
+        <w:t xml:space="preserve"> </w:t>
+      </w:r>
+      <w:r>
+        <w:rPr>
+          <w:bCs/>
+          <w:b/>
+        </w:rPr>
+        <w:t xml:space="preserve">Meteorologisk overvåking:</w:t>
+      </w:r>
+      <w:r>
+        <w:t xml:space="preserve"> </w:t>
+      </w:r>
+      <w:r>
+        <w:t xml:space="preserve">Henter faktiske værdata (vindstyrke, ekstremvær) for kritiske logistiske knutepunkter som Panama-kanalen, Shanghai, Rotterdam og Singapore.</w:t>
+      </w:r>
+      <w:r>
+        <w:t xml:space="preserve"> </w:t>
+      </w:r>
+      <w:r>
+        <w:t xml:space="preserve">-</w:t>
+      </w:r>
+      <w:r>
+        <w:t xml:space="preserve"> </w:t>
+      </w:r>
+      <w:r>
+        <w:rPr>
+          <w:bCs/>
+          <w:b/>
+        </w:rPr>
         <w:t xml:space="preserve">Dynamisk respons:</w:t>
       </w:r>
       <w:r>
         <w:t xml:space="preserve"> </w:t>
       </w:r>
       <w:r>
-        <w:t xml:space="preserve">Hvis sanntidsrisikoen for en rute øker (f.eks. Suez), vil beslutningsmodellen automatisk prioritere omruting eller flyfrakt før forsinkelsen faktisk er registrert i interne systemer. Dette flytter verktøyet fra å være reaktivt til å bli proaktivt.</w:t>
+        <w:t xml:space="preserve">Hvis sanntidsrisikoen øker (f.eks. orkanvarsel eller økt konfliktnivå), vil beslutningsmodellen automatisk prioritere proaktive tiltak som omruting eller flyfrakt. Dette flytter verktøyet fra en historisk analysemodell til et proaktivt styringsverktøy.</w:t>
       </w:r>
     </w:p>
     <w:bookmarkEnd w:id="38"/>

</xml_diff>